<commit_message>
refactor(core): consolidate docx utilities, twitter_sentiment_app packaging, synchronized requirements, and audit reports
</commit_message>
<xml_diff>
--- a/manuscript/JURNAL_MBG_SCOPUS_Q1_LATEST_2026.docx
+++ b/manuscript/JURNAL_MBG_SCOPUS_Q1_LATEST_2026.docx
@@ -22,13 +22,12 @@
         <w:spacing w:after="80"/>
         <w:jc w:val="center"/>
       </w:pPr>
-      <w:r/>
       <w:r>
         <w:rPr>
-          <w:rFonts w:ascii="Times New Roman" w:hAnsi="Times New Roman"/>
-          <w:sz w:val="24"/>
+          <w:b/>
+          <w:sz w:val="23"/>
         </w:rPr>
-        <w:t>Indri Anjar Kartika Sari¹, Catur Suratnoaji¹, Agus Widiyarta¹</w:t>
+        <w:t>Indri Anjar Kartika Sari¹*, Catur Suratnoaji¹, Agus Widiyarta¹</w:t>
       </w:r>
     </w:p>
     <w:p>
@@ -36,17 +35,17 @@
         <w:spacing w:after="280"/>
         <w:jc w:val="center"/>
       </w:pPr>
-      <w:r/>
       <w:r>
         <w:rPr>
-          <w:rFonts w:ascii="Times New Roman" w:hAnsi="Times New Roman"/>
-          <w:sz w:val="24"/>
+          <w:i/>
+          <w:color w:val="475569"/>
+          <w:sz w:val="19"/>
         </w:rPr>
         <w:t>¹ Department of Communication Science, Faculty of Social and Political Sciences,</w:t>
         <w:br/>
         <w:t>Universitas Pembangunan Nasional 'Veteran' Jawa Timur, Surabaya, 60294, Indonesia</w:t>
         <w:br/>
-        <w:t>Corresponding Author: indrianjar@gmail.com | ORCID: 0009-0002-8419-7231</w:t>
+        <w:t>*Corresponding Author: indrianjar@gmail.com | ORCID: 0009-0002-8419-7231</w:t>
       </w:r>
     </w:p>
     <w:tbl>
@@ -561,12 +560,10 @@
             </w:tcMar>
           </w:tcPr>
           <w:p>
-            <w:pPr/>
-            <w:r/>
-            <w:r>
-              <w:rPr>
-                <w:rFonts w:ascii="Times New Roman" w:hAnsi="Times New Roman"/>
-                <w:sz w:val="20"/>
+            <w:r>
+              <w:rPr>
+                <w:b/>
+                <w:sz w:val="19"/>
               </w:rPr>
               <w:t>Holdout Test Accuracy ($n=1,058$)</w:t>
             </w:r>
@@ -4474,13 +4471,12 @@
             <w:pPr>
               <w:jc w:val="center"/>
             </w:pPr>
-            <w:r/>
-            <w:r>
-              <w:rPr>
-                <w:rFonts w:ascii="Times New Roman" w:hAnsi="Times New Roman"/>
-                <w:sz w:val="20"/>
-              </w:rPr>
-              <w:t>Okt 2026</w:t>
+            <w:r>
+              <w:rPr>
+                <w:b/>
+                <w:sz w:val="17"/>
+              </w:rPr>
+              <w:t>Okt 2026*</w:t>
             </w:r>
           </w:p>
         </w:tc>

</xml_diff>